<commit_message>
Updated files until today
</commit_message>
<xml_diff>
--- a/3. MusicAndArts/1. CarnaticMusicPlusOthers/0. Books/SahajayogaBhajansAndNotes/0. Bhajans_WithWordToWordTranslations/10.ShriAllahShriRama.docx
+++ b/3. MusicAndArts/1. CarnaticMusicPlusOthers/0. Books/SahajayogaBhajansAndNotes/0. Bhajans_WithWordToWordTranslations/10.ShriAllahShriRama.docx
@@ -484,7 +484,7 @@
         <w:rPr>
           <w:rtl w:val="0"/>
         </w:rPr>
-        <w:t xml:space="preserve">(Theme - Islam, Shri Ram and vandematharam; Composed in Atlanta, USA, inspired somewhat by the recent events and discussions in India about Shri Ram Mandir in Ayodhya and some saying those following Islam can't sing Vandematharam)</w:t>
+        <w:t xml:space="preserve">(Theme - Islam, Shri Ram and vandematharam; Composed in Atlanta, USA, inspired somewhat by the recent events and discussions in India about Shri Ram Mandir in Ayodhya and some saying those following Islam can't sing Indian National song Vandematharam)</w:t>
       </w:r>
     </w:p>
     <w:p>
@@ -615,18 +615,18 @@
         <w:rPr>
           <w:rtl w:val="0"/>
         </w:rPr>
-        <w:t xml:space="preserve">వినిననె నా మది నిండుగా </w:t>
-      </w:r>
-    </w:p>
-    <w:p>
-      <w:pPr>
-        <w:rPr/>
-      </w:pPr>
-      <w:r>
-        <w:rPr>
-          <w:rtl w:val="0"/>
-        </w:rPr>
-        <w:t xml:space="preserve">మత చాందసం నశియించుగా</w:t>
+        <w:t xml:space="preserve">వినిననె నా మది నిండగ‌ (నిండుగా)</w:t>
+      </w:r>
+    </w:p>
+    <w:p>
+      <w:pPr>
+        <w:rPr/>
+      </w:pPr>
+      <w:r>
+        <w:rPr>
+          <w:rtl w:val="0"/>
+        </w:rPr>
+        <w:t xml:space="preserve">మత చాందసం నశియించగ (నశియించుగా)</w:t>
       </w:r>
     </w:p>
     <w:p>

</xml_diff>